<commit_message>
Restore readable original time range names for clip and understanding groups
</commit_message>
<xml_diff>
--- a/src/visioncortex/templates/DataRetentionGuide.docx
+++ b/src/visioncortex/templates/DataRetentionGuide.docx
@@ -469,7 +469,7 @@
         <w:br/>
         <w:t xml:space="preserve">    Index.json                 设备日总索引</w:t>
         <w:br/>
-        <w:t xml:space="preserve">    Clips/110101/</w:t>
+        <w:t xml:space="preserve">    Clips/原片起止_类别_标识/</w:t>
         <w:br/>
         <w:t xml:space="preserve">      Index.json               此原片的区间清单及状态</w:t>
         <w:br/>
@@ -483,7 +483,7 @@
         <w:br/>
         <w:t xml:space="preserve">    Index.json                 理解索引与进度</w:t>
         <w:br/>
-        <w:t xml:space="preserve">    110101/</w:t>
+        <w:t xml:space="preserve">    原片起止_类别_标识/</w:t>
         <w:br/>
         <w:t xml:space="preserve">      Understanding.json       此原片的理解汇总</w:t>
         <w:br/>
@@ -504,7 +504,7 @@
     </w:p>
     <w:p>
       <w:r>
-        <w:t>上例的 110101 是原片目录名，不是实验类别。112631 与 112631_001 等独立原片分别对应各自的处理和理解目录。历史平铺 MetaVideo 原片按原文件主名分组。目录里的文件清单以 Index.json 为准。</w:t>
+        <w:t>原片仍保留采集编号。两处结果目录保留“起止时间_类别_标识”的命名样式，使用原片实际完整起止时间；目录内文件使用各自筛选区间的时间。类别表示目录内的已观察内容，不代表原片全程都在实验。独立原片分别对应独立目录。尚缺可靠时间时明确显示 TimePending，取得时间后迁移。</w:t>
       </w:r>
     </w:p>
     <w:p>

</xml_diff>

<commit_message>
Keep processing states in JSON and name originals by recorded frame extent
</commit_message>
<xml_diff>
--- a/src/visioncortex/templates/DataRetentionGuide.docx
+++ b/src/visioncortex/templates/DataRetentionGuide.docx
@@ -734,7 +734,7 @@
                 <w:b w:val="0"/>
                 <w:sz w:val="20"/>
               </w:rPr>
-              <w:t>ActivityPendingClassification</w:t>
+              <w:t>NoExperimentActivity</w:t>
             </w:r>
           </w:p>
         </w:tc>
@@ -753,55 +753,17 @@
                 <w:b w:val="0"/>
                 <w:sz w:val="20"/>
               </w:rPr>
-              <w:t>活动过程已选中，但实验类型依据仍不足。可以先有过程视频，类型继续待判断。</w:t>
-            </w:r>
-          </w:p>
-        </w:tc>
-      </w:tr>
-      <w:tr>
-        <w:trPr>
-          <w:cantSplit/>
-        </w:trPr>
-        <w:tc>
-          <w:tcPr>
-            <w:tcW w:type="dxa" w:w="4176"/>
-            <w:vAlign w:val="center"/>
-            <w:shd w:fill="F5F7F9"/>
-          </w:tcPr>
-          <w:p>
-            <w:pPr>
-              <w:spacing w:after="100" w:before="100" w:line="259" w:lineRule="auto"/>
-            </w:pPr>
-            <w:r>
-              <w:rPr>
-                <w:b w:val="0"/>
-                <w:sz w:val="20"/>
-              </w:rPr>
-              <w:t>PendingValueReview</w:t>
-            </w:r>
-          </w:p>
-        </w:tc>
-        <w:tc>
-          <w:tcPr>
-            <w:tcW w:type="dxa" w:w="5544"/>
-            <w:vAlign w:val="center"/>
-            <w:shd w:fill="F5F7F9"/>
-          </w:tcPr>
-          <w:p>
-            <w:pPr>
-              <w:spacing w:after="100" w:before="100" w:line="259" w:lineRule="auto"/>
-            </w:pPr>
-            <w:r>
-              <w:rPr>
-                <w:b w:val="0"/>
-                <w:sz w:val="20"/>
-              </w:rPr>
-              <w:t>价值尚未判断完成。保留状态和来源，不把它当作无价值，也不据此新增视频。</w:t>
+              <w:t>尚未归类为实验，具体待判断状态写在 JSON 中，不等于无价值。只有选中且校验通过的视频才发布。</w:t>
             </w:r>
           </w:p>
         </w:tc>
       </w:tr>
     </w:tbl>
+    <w:p>
+      <w:r>
+        <w:t>待判断、处理中及失败是 JSON 内的处理状态，不加入目录或文件的类别名称。目录时间优先取当前原片有效 RGB 帧的完整首尾范围，不采用整次连续录制的总起点或恢复件继承的公共窗口。原处理窗口及缺帧记录仍保留在 JSON 中，首尾范围不代表中间画面连续。</w:t>
+      </w:r>
+    </w:p>
     <w:p>
       <w:pPr>
         <w:pStyle w:val="Heading2"/>

</xml_diff>